<commit_message>
Combining pages into one folder, 2 css files
</commit_message>
<xml_diff>
--- a/Module-1.3/Submitted work/MoffatBayMarinaProject_Module_1.2_Alexander,Max,Jordan,Aftab_CSD460.docx
+++ b/Module-1.3/Submitted work/MoffatBayMarinaProject_Module_1.2_Alexander,Max,Jordan,Aftab_CSD460.docx
@@ -49,6 +49,16 @@
       </w:r>
     </w:p>
     <w:p>
+      <w:hyperlink r:id="rId4" w:history="1">
+        <w:r>
+          <w:rPr>
+            <w:rStyle w:val="Hyperlink"/>
+          </w:rPr>
+          <w:t>https://github.com/Panda-Alex21687/Moffat-Bay.git</w:t>
+        </w:r>
+      </w:hyperlink>
+    </w:p>
+    <w:p>
       <w:pPr>
         <w:pStyle w:val="Heading1"/>
       </w:pPr>
@@ -77,13 +87,7 @@
         <w:pStyle w:val="NormalWeb"/>
       </w:pPr>
       <w:r>
-        <w:t>In sight of the site</w:t>
-      </w:r>
-      <w:r>
-        <w:t>,</w:t>
-      </w:r>
-      <w:r>
-        <w:t xml:space="preserve"> we want to give customers an easy way to manage the important parts of their visit online. We are developing the website so customers can create an account, log in, provide information about their boat, choose arrival and departure dates, and complete a marina reservation. Customers will also be able to return later and look up their reservation information when needed. By combining information, account features, and reservation tools into one website, our goal is to create a system that helps customers learn about Moffat Bay Marina, plan their trip, and manage their reservation from one convenient place.</w:t>
+        <w:t>In sight of the site, we want to give customers an easy way to manage the important parts of their visit online. We are developing the website so customers can create an account, log in, provide information about their boat, choose arrival and departure dates, and complete a marina reservation. Customers will also be able to return later and look up their reservation information when needed. By combining information, account features, and reservation tools into one website, our goal is to create a system that helps customers learn about Moffat Bay Marina, plan their trip, and manage their reservation from one convenient place.</w:t>
       </w:r>
     </w:p>
     <w:p>
@@ -226,6 +230,7 @@
           <w:bCs/>
           <w:u w:val="single"/>
         </w:rPr>
+        <w:lastRenderedPageBreak/>
         <w:t>Authentication:</w:t>
       </w:r>
       <w:r>
@@ -253,7 +258,6 @@
           <w:bCs/>
           <w:u w:val="single"/>
         </w:rPr>
-        <w:lastRenderedPageBreak/>
         <w:t>Registration:</w:t>
       </w:r>
       <w:r>
@@ -567,6 +571,7 @@
           <w:bCs/>
           <w:u w:val="single"/>
         </w:rPr>
+        <w:lastRenderedPageBreak/>
         <w:t>Session:</w:t>
       </w:r>
       <w:r>
@@ -577,26 +582,15 @@
         <w:br/>
       </w:r>
       <w:r>
-        <w:t xml:space="preserve">A way for the website to remember that a customer has successfully logged in while they move between different </w:t>
+        <w:t>A way for the website to remember that a customer has successfully logged in while they move between different pages.</w:t>
       </w:r>
-      <w:proofErr w:type="spellStart"/>
-      <w:r>
-        <w:t>pages.</w:t>
-      </w:r>
-      <w:proofErr w:type="spellEnd"/>
     </w:p>
     <w:p>
       <w:pPr>
         <w:pStyle w:val="Heading1"/>
       </w:pPr>
-      <w:proofErr w:type="spellStart"/>
       <w:r>
-        <w:lastRenderedPageBreak/>
-        <w:t>User</w:t>
-      </w:r>
-      <w:proofErr w:type="spellEnd"/>
-      <w:r>
-        <w:t xml:space="preserve"> Personas</w:t>
+        <w:t>User Personas</w:t>
       </w:r>
       <w:r>
         <w:t xml:space="preserve"> 1.3</w:t>
@@ -634,7 +628,7 @@
                     <pic:cNvPicPr/>
                   </pic:nvPicPr>
                   <pic:blipFill>
-                    <a:blip r:embed="rId4">
+                    <a:blip r:embed="rId5">
                       <a:extLst>
                         <a:ext uri="{28A0092B-C50C-407E-A947-70E740481C1C}">
                           <a14:useLocalDpi xmlns:a14="http://schemas.microsoft.com/office/drawing/2010/main" val="0"/>
@@ -690,7 +684,7 @@
                     <pic:cNvPicPr/>
                   </pic:nvPicPr>
                   <pic:blipFill>
-                    <a:blip r:embed="rId5">
+                    <a:blip r:embed="rId6">
                       <a:extLst>
                         <a:ext uri="{28A0092B-C50C-407E-A947-70E740481C1C}">
                           <a14:useLocalDpi xmlns:a14="http://schemas.microsoft.com/office/drawing/2010/main" val="0"/>
@@ -739,7 +733,7 @@
                     <pic:cNvPicPr/>
                   </pic:nvPicPr>
                   <pic:blipFill>
-                    <a:blip r:embed="rId6">
+                    <a:blip r:embed="rId7">
                       <a:extLst>
                         <a:ext uri="{28A0092B-C50C-407E-A947-70E740481C1C}">
                           <a14:useLocalDpi xmlns:a14="http://schemas.microsoft.com/office/drawing/2010/main" val="0"/>
@@ -802,28 +796,12 @@
     </w:p>
     <w:p>
       <w:r>
-        <w:t xml:space="preserve">UST-05: As a customer whose boat slip sizes are not available </w:t>
-      </w:r>
-      <w:proofErr w:type="gramStart"/>
-      <w:r>
-        <w:t>at the moment</w:t>
-      </w:r>
-      <w:proofErr w:type="gramEnd"/>
-      <w:r>
-        <w:t xml:space="preserve">, I want to be informed that these slips are not available and have a clear path to sign up for the waitlist. </w:t>
+        <w:t xml:space="preserve">UST-05: As a customer whose boat slip sizes are not available at the moment, I want to be informed that these slips are not available and have a clear path to sign up for the waitlist. </w:t>
       </w:r>
     </w:p>
     <w:p>
       <w:r>
-        <w:t xml:space="preserve">UST-06: As a customer </w:t>
-      </w:r>
-      <w:proofErr w:type="gramStart"/>
-      <w:r>
-        <w:t>who’s</w:t>
-      </w:r>
-      <w:proofErr w:type="gramEnd"/>
-      <w:r>
-        <w:t xml:space="preserve"> size slip is not available, I want to know how many people are ahead of me so I can decide whether to join the waitlist.</w:t>
+        <w:t>UST-06: As a customer who’s size slip is not available, I want to know how many people are ahead of me so I can decide whether to join the waitlist.</w:t>
       </w:r>
     </w:p>
     <w:p>
@@ -1995,15 +1973,7 @@
           <w:p>
             <w:r>
               <w:lastRenderedPageBreak/>
-              <w:t xml:space="preserve">Create </w:t>
-            </w:r>
-            <w:proofErr w:type="gramStart"/>
-            <w:r>
-              <w:t>marina</w:t>
-            </w:r>
-            <w:proofErr w:type="gramEnd"/>
-            <w:r>
-              <w:t xml:space="preserve"> About Us/information content</w:t>
+              <w:t>Create marina About Us/information content</w:t>
             </w:r>
           </w:p>
         </w:tc>
@@ -5200,15 +5170,7 @@
           </w:tcPr>
           <w:p>
             <w:r>
-              <w:t xml:space="preserve">Test </w:t>
-            </w:r>
-            <w:proofErr w:type="gramStart"/>
-            <w:r>
-              <w:t>lookup</w:t>
-            </w:r>
-            <w:proofErr w:type="gramEnd"/>
-            <w:r>
-              <w:t xml:space="preserve"> and history results</w:t>
+              <w:t>Test lookup and history results</w:t>
             </w:r>
           </w:p>
         </w:tc>
@@ -5886,15 +5848,7 @@
           </w:tcPr>
           <w:p>
             <w:r>
-              <w:t xml:space="preserve">Create </w:t>
-            </w:r>
-            <w:proofErr w:type="gramStart"/>
-            <w:r>
-              <w:t>marina</w:t>
-            </w:r>
-            <w:proofErr w:type="gramEnd"/>
-            <w:r>
-              <w:t xml:space="preserve"> About Us/information content</w:t>
+              <w:t>Create marina About Us/information content</w:t>
             </w:r>
           </w:p>
         </w:tc>
@@ -9872,15 +9826,7 @@
           </w:tcPr>
           <w:p>
             <w:r>
-              <w:t xml:space="preserve">Test </w:t>
-            </w:r>
-            <w:proofErr w:type="gramStart"/>
-            <w:r>
-              <w:t>lookup</w:t>
-            </w:r>
-            <w:proofErr w:type="gramEnd"/>
-            <w:r>
-              <w:t xml:space="preserve"> and history results</w:t>
+              <w:t>Test lookup and history results</w:t>
             </w:r>
           </w:p>
         </w:tc>
@@ -10656,13 +10602,8 @@
             <w:vAlign w:val="center"/>
           </w:tcPr>
           <w:p>
-            <w:proofErr w:type="gramStart"/>
-            <w:r>
-              <w:t>Group Green</w:t>
-            </w:r>
-            <w:proofErr w:type="gramEnd"/>
-            <w:r>
-              <w:t xml:space="preserve"> should review and approve or adjust the estimates using Planning Poker before final submission.</w:t>
+            <w:r>
+              <w:t>Group Green should review and approve or adjust the estimates using Planning Poker before final submission.</w:t>
             </w:r>
           </w:p>
         </w:tc>
@@ -11818,6 +11759,29 @@
       <w:outlineLvl w:val="9"/>
     </w:pPr>
   </w:style>
+  <w:style w:type="character" w:styleId="Hyperlink">
+    <w:name w:val="Hyperlink"/>
+    <w:basedOn w:val="DefaultParagraphFont"/>
+    <w:uiPriority w:val="99"/>
+    <w:unhideWhenUsed/>
+    <w:rsid w:val="00903F75"/>
+    <w:rPr>
+      <w:color w:val="467886" w:themeColor="hyperlink"/>
+      <w:u w:val="single"/>
+    </w:rPr>
+  </w:style>
+  <w:style w:type="character" w:styleId="UnresolvedMention">
+    <w:name w:val="Unresolved Mention"/>
+    <w:basedOn w:val="DefaultParagraphFont"/>
+    <w:uiPriority w:val="99"/>
+    <w:semiHidden/>
+    <w:unhideWhenUsed/>
+    <w:rsid w:val="00903F75"/>
+    <w:rPr>
+      <w:color w:val="605E5C"/>
+      <w:shd w:val="clear" w:color="auto" w:fill="E1DFDD"/>
+    </w:rPr>
+  </w:style>
 </w:styles>
 </file>
 

</xml_diff>